<commit_message>
Publish retention activity-center filtering V1.1
</commit_message>
<xml_diff>
--- a/retention-activity/docs/保客活动号码级准入_需求说明.docx
+++ b/retention-activity/docs/保客活动号码级准入_需求说明.docx
@@ -15,7 +15,7 @@
         <w:pStyle w:val="Subtitle"/>
       </w:pPr>
       <w:r>
-        <w:t>研发评审版 V1.0　2026年9月10日</w:t>
+        <w:t>研发评审版 V1.1　2026年9月10日</w:t>
       </w:r>
     </w:p>
     <w:p>
@@ -23,7 +23,7 @@
         <w:pStyle w:val="Heading1"/>
       </w:pPr>
       <w:r>
-        <w:t>1 目标与改造范围</w:t>
+        <w:t>1 目标与系统分工</w:t>
       </w:r>
     </w:p>
     <w:p>
@@ -110,7 +110,7 @@
                 <w:color w:val="FFFFFF"/>
                 <w:sz w:val="20"/>
               </w:rPr>
-              <w:t>本次改造</w:t>
+              <w:t>本次分工</w:t>
             </w:r>
           </w:p>
         </w:tc>
@@ -212,7 +212,7 @@
                 <w:b w:val="0"/>
                 <w:sz w:val="20"/>
               </w:rPr>
-              <w:t>调整活动关联卡券查询接口，识别活动准入等级，按场景执行领取规则与核销方式过滤。</w:t>
+              <w:t>沿用现有查询接口，已提供场景、领取规则、核销方式等字段。本次复用既有能力。</w:t>
             </w:r>
           </w:p>
         </w:tc>
@@ -244,7 +244,7 @@
                 <w:b w:val="0"/>
                 <w:sz w:val="20"/>
               </w:rPr>
-              <w:t>F01–F05</w:t>
+              <w:t>F01</w:t>
             </w:r>
           </w:p>
         </w:tc>
@@ -313,7 +313,7 @@
                 <w:b w:val="0"/>
                 <w:sz w:val="20"/>
               </w:rPr>
-              <w:t>调整前端与卡券中心之间的接口对接，传递查询上下文并适配返回结果。</w:t>
+              <w:t>读取既有接口返回字段，按当前准入和卡券场景执行过滤，再向管理后台返回结果。</w:t>
             </w:r>
           </w:p>
         </w:tc>
@@ -345,7 +345,7 @@
                 <w:b w:val="0"/>
                 <w:sz w:val="20"/>
               </w:rPr>
-              <w:t>F06–F09</w:t>
+              <w:t>F02–F09</w:t>
             </w:r>
           </w:p>
         </w:tc>
@@ -481,7 +481,7 @@
     </w:p>
     <w:p>
       <w:r>
-        <w:t>本次覆盖新建活动的页面联动与活动关联卡券查询改造。历史活动编辑、复制、旧调用兼容和提交复核的具体责任见第8节待确认事项。用户标识仍为oneid和VIN，不新增手机号发券主键。</w:t>
+        <w:t>本次覆盖新建活动的页面联动与活动关联卡券查询改造。历史活动编辑、复制、旧调用兼容和提交复核时点见第8节待确认事项。用户标识仍为oneid和VIN，不新增手机号发券主键。</w:t>
       </w:r>
     </w:p>
     <w:p>
@@ -509,7 +509,7 @@
       <w:r>
         <w:drawing>
           <wp:inline xmlns:a="http://schemas.openxmlformats.org/drawingml/2006/main" xmlns:pic="http://schemas.openxmlformats.org/drawingml/2006/picture">
-            <wp:extent cx="6217920" cy="6580632"/>
+            <wp:extent cx="6217920" cy="7098792"/>
             <wp:docPr id="1" name="Picture 1" descr="三系统协作流程"/>
             <wp:cNvGraphicFramePr>
               <a:graphicFrameLocks noChangeAspect="1"/>
@@ -530,7 +530,7 @@
                   <pic:spPr>
                     <a:xfrm>
                       <a:off x="0" y="0"/>
-                      <a:ext cx="6217920" cy="6580632"/>
+                      <a:ext cx="6217920" cy="7098792"/>
                     </a:xfrm>
                     <a:prstGeom prst="rect"/>
                   </pic:spPr>
@@ -543,7 +543,7 @@
     </w:p>
     <w:p>
       <w:r>
-        <w:t>虚线表示提交复核建议。卡券中心负责返回经过规则过滤的结果；活动中心后端负责传参和结果适配。</w:t>
+        <w:t>卡券中心沿用既有接口返回字段，活动中心后端执行过滤并返回管理后台。虚线表示活动中心提交复核建议，触发时点与范围待确认。</w:t>
       </w:r>
     </w:p>
     <w:p>
@@ -613,7 +613,7 @@
     </w:p>
     <w:p>
       <w:r>
-        <w:t>以下条件叠加在现有卡券关联条件上。通过新增过滤仅表示满足本次规则，仍需满足既有状态、场景等关联要求。</w:t>
+        <w:t>以下条件由活动中心后端根据卡券中心已返回的字段执行，叠加在现有卡券关联条件上。通过新增过滤仅表示满足本次规则，仍需满足既有状态、场景等关联要求。</w:t>
       </w:r>
     </w:p>
     <w:tbl>
@@ -1028,7 +1028,7 @@
                 <w:b w:val="0"/>
                 <w:sz w:val="20"/>
               </w:rPr>
-              <w:t>不返回，不允许关联</w:t>
+              <w:t>活动中心排除，不允许关联</w:t>
             </w:r>
           </w:p>
         </w:tc>
@@ -1577,7 +1577,7 @@
     </w:p>
     <w:p>
       <w:r>
-        <w:t>“线上核销”要求核销方式等于该业务含义，不能用名称包含“线上”判断。线上与线下组合、缺失和未知值均不等于线上核销。边界示例不代表真实接口已经存在对应枚举；正式编码须由卡券中心提供。</w:t>
+        <w:t>“线上核销”要求核销方式等于该业务含义，不能用名称包含“线上”判断。线上与线下组合、缺失和未知值均不等于线上核销。边界示例不代表真实接口已经存在对应枚举；活动中心按既有接口正式编码进行映射。</w:t>
       </w:r>
     </w:p>
     <w:p>
@@ -1603,7 +1603,7 @@
     </w:p>
     <w:p>
       <w:r>
-        <w:t>搜索、刷新、重置和翻页必须持续应用准入条件。建议在全部适用条件过滤后统计总数和分页，避免只从当前页删除不合规券而造成页数和结果缺失。无结果时返回空集合和总数0的具体格式按正式接口合同约定。</w:t>
+        <w:t>搜索、刷新、重置和翻页必须持续应用准入条件。建议活动中心基于完整过滤结果计算总数与分页，避免只从卡券中心当前页删除不合规券而造成结果缺失。上游分页衔接、空集合及总数格式见Q05。</w:t>
       </w:r>
     </w:p>
     <w:p>
@@ -2804,7 +2804,7 @@
     </w:p>
     <w:p>
       <w:r>
-        <w:t>提供方为卡券中心，调用方为活动中心后端。前端提交当前活动准入和查询上下文，活动中心后端完成正式字段映射，卡券中心执行过滤。以下为业务语义，不作为正式字段名或枚举编码。</w:t>
+        <w:t>用户已确认卡券中心现有接口已提供所需字段。管理后台向活动中心提交准入与查询条件，活动中心读取卡券中心返回字段后执行过滤。以下按调用方向说明业务语义，正式字段及枚举沿用既有合同。</w:t>
       </w:r>
     </w:p>
     <w:tbl>
@@ -2815,9 +2815,9 @@
         <w:tblLook w:firstColumn="1" w:firstRow="1" w:lastColumn="0" w:lastRow="0" w:noHBand="0" w:noVBand="1" w:val="04A0"/>
       </w:tblPr>
       <w:tblGrid>
-        <w:gridCol w:w="1613"/>
-        <w:gridCol w:w="3110"/>
-        <w:gridCol w:w="5357"/>
+        <w:gridCol w:w="1872"/>
+        <w:gridCol w:w="2736"/>
+        <w:gridCol w:w="5472"/>
       </w:tblGrid>
       <w:tr>
         <w:trPr>
@@ -2826,7 +2826,7 @@
         </w:trPr>
         <w:tc>
           <w:tcPr>
-            <w:tcW w:type="dxa" w:w="1613"/>
+            <w:tcW w:type="dxa" w:w="1872"/>
             <w:vAlign w:val="center"/>
             <w:shd w:fill="234568"/>
             <w:tcMar>
@@ -2859,7 +2859,7 @@
         </w:tc>
         <w:tc>
           <w:tcPr>
-            <w:tcW w:type="dxa" w:w="3110"/>
+            <w:tcW w:type="dxa" w:w="2736"/>
             <w:vAlign w:val="center"/>
             <w:shd w:fill="234568"/>
             <w:tcMar>
@@ -2892,7 +2892,7 @@
         </w:tc>
         <w:tc>
           <w:tcPr>
-            <w:tcW w:type="dxa" w:w="5357"/>
+            <w:tcW w:type="dxa" w:w="5472"/>
             <w:vAlign w:val="center"/>
             <w:shd w:fill="234568"/>
             <w:tcMar>
@@ -2930,7 +2930,7 @@
         </w:trPr>
         <w:tc>
           <w:tcPr>
-            <w:tcW w:type="dxa" w:w="1613"/>
+            <w:tcW w:type="dxa" w:w="1872"/>
             <w:vAlign w:val="center"/>
             <w:shd w:fill="FFFFFF"/>
             <w:tcMar>
@@ -2956,13 +2956,13 @@
                 <w:b w:val="0"/>
                 <w:sz w:val="20"/>
               </w:rPr>
-              <w:t>请求</w:t>
+              <w:t>前端→活动中心</w:t>
             </w:r>
           </w:p>
         </w:tc>
         <w:tc>
           <w:tcPr>
-            <w:tcW w:type="dxa" w:w="3110"/>
+            <w:tcW w:type="dxa" w:w="2736"/>
             <w:vAlign w:val="center"/>
             <w:shd w:fill="FFFFFF"/>
             <w:tcMar>
@@ -2988,13 +2988,13 @@
                 <w:b w:val="0"/>
                 <w:sz w:val="20"/>
               </w:rPr>
-              <w:t>活动准入等级</w:t>
+              <w:t>当前准入等级及查询条件</w:t>
             </w:r>
           </w:p>
         </w:tc>
         <w:tc>
           <w:tcPr>
-            <w:tcW w:type="dxa" w:w="5357"/>
+            <w:tcW w:type="dxa" w:w="5472"/>
             <w:vAlign w:val="center"/>
             <w:shd w:fill="FFFFFF"/>
             <w:tcMar>
@@ -3020,7 +3020,7 @@
                 <w:b w:val="0"/>
                 <w:sz w:val="20"/>
               </w:rPr>
-              <w:t>号码级用于触发过滤。未传、未知值与旧调用兼容见Q05。</w:t>
+              <w:t>准入供活动中心判断是否执行号码级过滤，搜索和翻页持续保留。</w:t>
             </w:r>
           </w:p>
         </w:tc>
@@ -3031,7 +3031,7 @@
         </w:trPr>
         <w:tc>
           <w:tcPr>
-            <w:tcW w:type="dxa" w:w="1613"/>
+            <w:tcW w:type="dxa" w:w="1872"/>
             <w:vAlign w:val="center"/>
             <w:shd w:fill="F1F5FA"/>
             <w:tcMar>
@@ -3057,13 +3057,13 @@
                 <w:b w:val="0"/>
                 <w:sz w:val="20"/>
               </w:rPr>
-              <w:t>请求</w:t>
+              <w:t>活动中心→卡券中心</w:t>
             </w:r>
           </w:p>
         </w:tc>
         <w:tc>
           <w:tcPr>
-            <w:tcW w:type="dxa" w:w="3110"/>
+            <w:tcW w:type="dxa" w:w="2736"/>
             <w:vAlign w:val="center"/>
             <w:shd w:fill="F1F5FA"/>
             <w:tcMar>
@@ -3089,13 +3089,13 @@
                 <w:b w:val="0"/>
                 <w:sz w:val="20"/>
               </w:rPr>
-              <w:t>卡券业务场景</w:t>
+              <w:t>既有卡券查询条件</w:t>
             </w:r>
           </w:p>
         </w:tc>
         <w:tc>
           <w:tcPr>
-            <w:tcW w:type="dxa" w:w="5357"/>
+            <w:tcW w:type="dxa" w:w="5472"/>
             <w:vAlign w:val="center"/>
             <w:shd w:fill="F1F5FA"/>
             <w:tcMar>
@@ -3121,7 +3121,7 @@
                 <w:b w:val="0"/>
                 <w:sz w:val="20"/>
               </w:rPr>
-              <w:t>保留当前场景查询。以正式场景编码识别BIMC（新）及维修保养（新）。</w:t>
+              <w:t>按原接口传递场景、券ID、名称及分页等条件，无需新增传入准入等级。</w:t>
             </w:r>
           </w:p>
         </w:tc>
@@ -3132,7 +3132,7 @@
         </w:trPr>
         <w:tc>
           <w:tcPr>
-            <w:tcW w:type="dxa" w:w="1613"/>
+            <w:tcW w:type="dxa" w:w="1872"/>
             <w:vAlign w:val="center"/>
             <w:shd w:fill="FFFFFF"/>
             <w:tcMar>
@@ -3158,13 +3158,13 @@
                 <w:b w:val="0"/>
                 <w:sz w:val="20"/>
               </w:rPr>
-              <w:t>请求</w:t>
+              <w:t>卡券中心→活动中心</w:t>
             </w:r>
           </w:p>
         </w:tc>
         <w:tc>
           <w:tcPr>
-            <w:tcW w:type="dxa" w:w="3110"/>
+            <w:tcW w:type="dxa" w:w="2736"/>
             <w:vAlign w:val="center"/>
             <w:shd w:fill="FFFFFF"/>
             <w:tcMar>
@@ -3190,13 +3190,13 @@
                 <w:b w:val="0"/>
                 <w:sz w:val="20"/>
               </w:rPr>
-              <w:t>券ID、名称、分页条件</w:t>
+              <w:t>既有卡券数据及规则字段</w:t>
             </w:r>
           </w:p>
         </w:tc>
         <w:tc>
           <w:tcPr>
-            <w:tcW w:type="dxa" w:w="5357"/>
+            <w:tcW w:type="dxa" w:w="5472"/>
             <w:vAlign w:val="center"/>
             <w:shd w:fill="FFFFFF"/>
             <w:tcMar>
@@ -3222,7 +3222,7 @@
                 <w:b w:val="0"/>
                 <w:sz w:val="20"/>
               </w:rPr>
-              <w:t>保留既有搜索能力，并持续携带准入条件。</w:t>
+              <w:t>已提供卡券业务场景、领取规则、核销方式。活动中心按字段值逐券判断。</w:t>
             </w:r>
           </w:p>
         </w:tc>
@@ -3233,7 +3233,7 @@
         </w:trPr>
         <w:tc>
           <w:tcPr>
-            <w:tcW w:type="dxa" w:w="1613"/>
+            <w:tcW w:type="dxa" w:w="1872"/>
             <w:vAlign w:val="center"/>
             <w:shd w:fill="F1F5FA"/>
             <w:tcMar>
@@ -3259,13 +3259,13 @@
                 <w:b w:val="0"/>
                 <w:sz w:val="20"/>
               </w:rPr>
-              <w:t>响应（建议）</w:t>
+              <w:t>活动中心→前端</w:t>
             </w:r>
           </w:p>
         </w:tc>
         <w:tc>
           <w:tcPr>
-            <w:tcW w:type="dxa" w:w="3110"/>
+            <w:tcW w:type="dxa" w:w="2736"/>
             <w:vAlign w:val="center"/>
             <w:shd w:fill="F1F5FA"/>
             <w:tcMar>
@@ -3291,13 +3291,13 @@
                 <w:b w:val="0"/>
                 <w:sz w:val="20"/>
               </w:rPr>
-              <w:t>卡券标识、名称及场景</w:t>
+              <w:t>过滤后的候选结果</w:t>
             </w:r>
           </w:p>
         </w:tc>
         <w:tc>
           <w:tcPr>
-            <w:tcW w:type="dxa" w:w="5357"/>
+            <w:tcW w:type="dxa" w:w="5472"/>
             <w:vAlign w:val="center"/>
             <w:shd w:fill="F1F5FA"/>
             <w:tcMar>
@@ -3323,209 +3323,7 @@
                 <w:b w:val="0"/>
                 <w:sz w:val="20"/>
               </w:rPr>
-              <w:t>满足原关联结果带回；场景用于逐券复核。</w:t>
-            </w:r>
-          </w:p>
-        </w:tc>
-      </w:tr>
-      <w:tr>
-        <w:trPr>
-          <w:cantSplit/>
-        </w:trPr>
-        <w:tc>
-          <w:tcPr>
-            <w:tcW w:type="dxa" w:w="1613"/>
-            <w:vAlign w:val="center"/>
-            <w:shd w:fill="FFFFFF"/>
-            <w:tcMar>
-              <w:top w:w="95" w:type="dxa"/>
-              <w:bottom w:w="95" w:type="dxa"/>
-              <w:left w:w="110" w:type="dxa"/>
-              <w:right w:w="110" w:type="dxa"/>
-            </w:tcMar>
-            <w:tcBorders>
-              <w:top w:val="single" w:sz="4" w:color="D9D9D9"/>
-              <w:bottom w:val="single" w:sz="4" w:color="D9D9D9"/>
-              <w:left w:val="single" w:sz="4" w:color="D9D9D9"/>
-              <w:right w:val="single" w:sz="4" w:color="D9D9D9"/>
-            </w:tcBorders>
-          </w:tcPr>
-          <w:p>
-            <w:pPr>
-              <w:spacing w:after="0" w:line="276" w:lineRule="auto"/>
-              <w:jc w:val="left"/>
-            </w:pPr>
-            <w:r>
-              <w:rPr>
-                <w:b w:val="0"/>
-                <w:sz w:val="20"/>
-              </w:rPr>
-              <w:t>响应（建议）</w:t>
-            </w:r>
-          </w:p>
-        </w:tc>
-        <w:tc>
-          <w:tcPr>
-            <w:tcW w:type="dxa" w:w="3110"/>
-            <w:vAlign w:val="center"/>
-            <w:shd w:fill="FFFFFF"/>
-            <w:tcMar>
-              <w:top w:w="95" w:type="dxa"/>
-              <w:bottom w:w="95" w:type="dxa"/>
-              <w:left w:w="110" w:type="dxa"/>
-              <w:right w:w="110" w:type="dxa"/>
-            </w:tcMar>
-            <w:tcBorders>
-              <w:top w:val="single" w:sz="4" w:color="D9D9D9"/>
-              <w:bottom w:val="single" w:sz="4" w:color="D9D9D9"/>
-              <w:left w:val="single" w:sz="4" w:color="D9D9D9"/>
-              <w:right w:val="single" w:sz="4" w:color="D9D9D9"/>
-            </w:tcBorders>
-          </w:tcPr>
-          <w:p>
-            <w:pPr>
-              <w:spacing w:after="0" w:line="276" w:lineRule="auto"/>
-              <w:jc w:val="left"/>
-            </w:pPr>
-            <w:r>
-              <w:rPr>
-                <w:b w:val="0"/>
-                <w:sz w:val="20"/>
-              </w:rPr>
-              <w:t>领取规则、核销方式</w:t>
-            </w:r>
-          </w:p>
-        </w:tc>
-        <w:tc>
-          <w:tcPr>
-            <w:tcW w:type="dxa" w:w="5357"/>
-            <w:vAlign w:val="center"/>
-            <w:shd w:fill="FFFFFF"/>
-            <w:tcMar>
-              <w:top w:w="95" w:type="dxa"/>
-              <w:bottom w:w="95" w:type="dxa"/>
-              <w:left w:w="110" w:type="dxa"/>
-              <w:right w:w="110" w:type="dxa"/>
-            </w:tcMar>
-            <w:tcBorders>
-              <w:top w:val="single" w:sz="4" w:color="D9D9D9"/>
-              <w:bottom w:val="single" w:sz="4" w:color="D9D9D9"/>
-              <w:left w:val="single" w:sz="4" w:color="D9D9D9"/>
-              <w:right w:val="single" w:sz="4" w:color="D9D9D9"/>
-            </w:tcBorders>
-          </w:tcPr>
-          <w:p>
-            <w:pPr>
-              <w:spacing w:after="0" w:line="276" w:lineRule="auto"/>
-              <w:jc w:val="left"/>
-            </w:pPr>
-            <w:r>
-              <w:rPr>
-                <w:b w:val="0"/>
-                <w:sz w:val="20"/>
-              </w:rPr>
-              <w:t>支持展示与校验，不从券名猜测规则。</w:t>
-            </w:r>
-          </w:p>
-        </w:tc>
-      </w:tr>
-      <w:tr>
-        <w:trPr>
-          <w:cantSplit/>
-        </w:trPr>
-        <w:tc>
-          <w:tcPr>
-            <w:tcW w:type="dxa" w:w="1613"/>
-            <w:vAlign w:val="center"/>
-            <w:shd w:fill="F1F5FA"/>
-            <w:tcMar>
-              <w:top w:w="95" w:type="dxa"/>
-              <w:bottom w:w="95" w:type="dxa"/>
-              <w:left w:w="110" w:type="dxa"/>
-              <w:right w:w="110" w:type="dxa"/>
-            </w:tcMar>
-            <w:tcBorders>
-              <w:top w:val="single" w:sz="4" w:color="D9D9D9"/>
-              <w:bottom w:val="single" w:sz="4" w:color="D9D9D9"/>
-              <w:left w:val="single" w:sz="4" w:color="D9D9D9"/>
-              <w:right w:val="single" w:sz="4" w:color="D9D9D9"/>
-            </w:tcBorders>
-          </w:tcPr>
-          <w:p>
-            <w:pPr>
-              <w:spacing w:after="0" w:line="276" w:lineRule="auto"/>
-              <w:jc w:val="left"/>
-            </w:pPr>
-            <w:r>
-              <w:rPr>
-                <w:b w:val="0"/>
-                <w:sz w:val="20"/>
-              </w:rPr>
-              <w:t>响应（建议）</w:t>
-            </w:r>
-          </w:p>
-        </w:tc>
-        <w:tc>
-          <w:tcPr>
-            <w:tcW w:type="dxa" w:w="3110"/>
-            <w:vAlign w:val="center"/>
-            <w:shd w:fill="F1F5FA"/>
-            <w:tcMar>
-              <w:top w:w="95" w:type="dxa"/>
-              <w:bottom w:w="95" w:type="dxa"/>
-              <w:left w:w="110" w:type="dxa"/>
-              <w:right w:w="110" w:type="dxa"/>
-            </w:tcMar>
-            <w:tcBorders>
-              <w:top w:val="single" w:sz="4" w:color="D9D9D9"/>
-              <w:bottom w:val="single" w:sz="4" w:color="D9D9D9"/>
-              <w:left w:val="single" w:sz="4" w:color="D9D9D9"/>
-              <w:right w:val="single" w:sz="4" w:color="D9D9D9"/>
-            </w:tcBorders>
-          </w:tcPr>
-          <w:p>
-            <w:pPr>
-              <w:spacing w:after="0" w:line="276" w:lineRule="auto"/>
-              <w:jc w:val="left"/>
-            </w:pPr>
-            <w:r>
-              <w:rPr>
-                <w:b w:val="0"/>
-                <w:sz w:val="20"/>
-              </w:rPr>
-              <w:t>过滤后的列表、总数与分页信息</w:t>
-            </w:r>
-          </w:p>
-        </w:tc>
-        <w:tc>
-          <w:tcPr>
-            <w:tcW w:type="dxa" w:w="5357"/>
-            <w:vAlign w:val="center"/>
-            <w:shd w:fill="F1F5FA"/>
-            <w:tcMar>
-              <w:top w:w="95" w:type="dxa"/>
-              <w:bottom w:w="95" w:type="dxa"/>
-              <w:left w:w="110" w:type="dxa"/>
-              <w:right w:w="110" w:type="dxa"/>
-            </w:tcMar>
-            <w:tcBorders>
-              <w:top w:val="single" w:sz="4" w:color="D9D9D9"/>
-              <w:bottom w:val="single" w:sz="4" w:color="D9D9D9"/>
-              <w:left w:val="single" w:sz="4" w:color="D9D9D9"/>
-              <w:right w:val="single" w:sz="4" w:color="D9D9D9"/>
-            </w:tcBorders>
-          </w:tcPr>
-          <w:p>
-            <w:pPr>
-              <w:spacing w:after="0" w:line="276" w:lineRule="auto"/>
-              <w:jc w:val="left"/>
-            </w:pPr>
-            <w:r>
-              <w:rPr>
-                <w:b w:val="0"/>
-                <w:sz w:val="20"/>
-              </w:rPr>
-              <w:t>前端展示服务端结果，不补回被过滤券。</w:t>
+              <w:t>活动中心返回合规卡券；总数与分页衔接见Q05，前端不补回被过滤券。</w:t>
             </w:r>
           </w:p>
         </w:tc>
@@ -3542,7 +3340,7 @@
     </w:p>
     <w:p>
       <w:r>
-        <w:t>F01–F03负责识别号码级并应用场景过滤。F04将同一规则覆盖搜索与分页路径。F05建议补齐校验所需返回信息，字段是否已有及如何兼容需核对正式合同。</w:t>
+        <w:t>F01为既有能力复用。所需字段已通过接口提供，本次无需卡券中心新增过滤接口、过滤能力或活动准入参数。</w:t>
       </w:r>
     </w:p>
     <w:p>
@@ -3555,7 +3353,7 @@
     </w:p>
     <w:p>
       <w:r>
-        <w:t>F06–F07调整入参、服务调用和返回适配。仅做前端过滤不能替代卡券中心查询过滤。F08建议在号码级查询失败时提示重试，避免降级到未过滤数据。</w:t>
+        <w:t>F02–F07负责接收准入、调用既有查询、映射返回字段、执行过滤并返回管理后台。F04对齐完整过滤结果与分页，F08约定异常处理。</w:t>
       </w:r>
     </w:p>
     <w:p>
@@ -3568,7 +3366,7 @@
     </w:p>
     <w:p>
       <w:r>
-        <w:t>F09建议在提交时按当前准入与每张券自身场景重新校验，覆盖旧草稿、等级切换及卡券配置变化。校验数据来源、接口责任和拦截时点见Q06；不因列表已经过滤就假定旧关联永久有效。</w:t>
+        <w:t>F09建议活动中心在提交时复用规则，按当前准入与每张券自身场景重新校验。触发时点、既有查询复用方式及历史数据范围见Q06。</w:t>
       </w:r>
     </w:p>
     <w:p>
@@ -4472,7 +4270,7 @@
                 <w:b w:val="0"/>
                 <w:sz w:val="20"/>
               </w:rPr>
-              <w:t>正式字段正确传递和映射，超时与旧调用按约定处理。</w:t>
+              <w:t>既有字段正确映射，由活动中心过滤；超时与旧调用按约定处理。</w:t>
             </w:r>
           </w:p>
         </w:tc>
@@ -5140,7 +4938,7 @@
                 <w:b w:val="0"/>
                 <w:sz w:val="20"/>
               </w:rPr>
-              <w:t>查询接口技术合同</w:t>
+              <w:t>既有字段映射与分页衔接</w:t>
             </w:r>
           </w:p>
         </w:tc>
@@ -5172,7 +4970,7 @@
                 <w:b w:val="0"/>
                 <w:sz w:val="20"/>
               </w:rPr>
-              <w:t>接口地址、方法、准入/场景/领取规则/核销方式正式字段及枚举、鉴权、分页、错误码与未传等级兼容。</w:t>
+              <w:t>字段已提供。需对齐既有正式字段与枚举映射、上游分页数据如何形成完整过滤结果及总数，以及活动中心异常和未传准入的兼容策略。</w:t>
             </w:r>
           </w:p>
         </w:tc>
@@ -5273,7 +5071,7 @@
                 <w:b w:val="0"/>
                 <w:sz w:val="20"/>
               </w:rPr>
-              <w:t>服务端复核接口由谁提供、何时调用，以及历史活动编辑/复制/草稿的兼容范围。</w:t>
+              <w:t>活动中心提交复核的触发时点、既有查询复用方式，以及历史活动编辑、复制、草稿的兼容范围。过滤责任已明确归活动中心。</w:t>
             </w:r>
           </w:p>
         </w:tc>
@@ -5491,23 +5289,58 @@
       </w:r>
     </w:p>
     <w:p>
+      <w:pPr>
+        <w:spacing w:line="260" w:lineRule="exact" w:after="80"/>
+      </w:pPr>
       <w:r>
+        <w:rPr>
+          <w:sz w:val="20"/>
+        </w:rPr>
         <w:t>S01 用户首次调整要求：准入前移、属性单选与默认值、非必填、商城交集、用户标识、号码级选人及用户领取规则。</w:t>
       </w:r>
     </w:p>
     <w:p>
+      <w:pPr>
+        <w:spacing w:line="260" w:lineRule="exact" w:after="80"/>
+      </w:pPr>
       <w:r>
+        <w:rPr>
+          <w:sz w:val="20"/>
+        </w:rPr>
         <w:t>S02 用户线上核销补充：BIMC（新）和维修保养（新）仅线上核销可关联号码级活动。</w:t>
       </w:r>
     </w:p>
     <w:p>
+      <w:pPr>
+        <w:spacing w:line="260" w:lineRule="exact" w:after="80"/>
+      </w:pPr>
       <w:r>
-        <w:t>S03 用户本次职责划分：卡券中心按准入与场景过滤，活动中心后端调整对接，管理后台调整位置及属性默认值。</w:t>
+        <w:rPr>
+          <w:sz w:val="20"/>
+        </w:rPr>
+        <w:t>S03 初次职责讨论：管理后台位置及默认值调整仍有效；原卡券中心过滤分工已由S04替代，不作为当前实施依据。</w:t>
       </w:r>
     </w:p>
     <w:p>
+      <w:pPr>
+        <w:spacing w:line="260" w:lineRule="exact" w:after="80"/>
+      </w:pPr>
       <w:r>
-        <w:t>J01 本次评审建议：分页顺序、返回信息、提交复核、异常兼容与旧选择处理；具体合同或策略待确认。</w:t>
+        <w:rPr>
+          <w:sz w:val="20"/>
+        </w:rPr>
+        <w:t>S04 用户最新职责确认：卡券中心已通过现有接口向活动中心提供所需字段，由活动中心过滤即可。本次不要求新增卡券中心过滤能力。</w:t>
+      </w:r>
+    </w:p>
+    <w:p>
+      <w:pPr>
+        <w:spacing w:line="260" w:lineRule="exact" w:after="80"/>
+      </w:pPr>
+      <w:r>
+        <w:rPr>
+          <w:sz w:val="20"/>
+        </w:rPr>
+        <w:t>J01 本次评审建议：分页衔接、提交复核时点、异常兼容与旧选择处理；具体实施方案或交互策略待确认。</w:t>
       </w:r>
     </w:p>
     <w:sectPr>

</xml_diff>